<commit_message>
Update README, localization, pre-scan confirmation modal, Thorough mode, and Show in Finder
</commit_message>
<xml_diff>
--- a/QuizMaster_GioiThieuUngDung.docx
+++ b/QuizMaster_GioiThieuUngDung.docx
@@ -46,15 +46,7 @@
           <w:sz w:val="22"/>
           <w:b/>
         </w:rPr>
-        <w:t>Phiên bản: v1.0.0 (Native Release)</w:t>
-      </w:r>
-    </w:p>
-    <w:p>
-      <w:r>
-        <w:rPr>
-          <w:sz w:val="22"/>
-        </w:rPr>
-        <w:t>Ngày phát hành: 12/08/2026</w:t>
+        <w:t>Phiên bản: v1.0.1 (Native Release)</w:t>
       </w:r>
     </w:p>
     <w:p>
@@ -64,7 +56,7 @@
           <w:b/>
           <w:color w:val="2B579A"/>
         </w:rPr>
-        <w:t>Tác giả / Creator: @tozn607 (Anh Vinh)</w:t>
+        <w:t>Tác giả / Creator: @tozn607</w:t>
       </w:r>
     </w:p>
     <w:p>
@@ -90,7 +82,7 @@
         <w:rPr>
           <w:sz w:val="22"/>
         </w:rPr>
-        <w:t>QuizMaster là giải pháp phần mềm tự học và tạo đề thi trắc nghiệm chuyên nghiệp dành cho hệ điều hành macOS. Ứng dụng được biên dịch 100% bằng ngôn ngữ Swift và nền tảng SwiftUI của Apple, cho phép chạy trực tiếp và mượt mà trên tất cả các dòng máy Mac (Apple Silicon M1/M2/M3/M4 &amp; Intel) mà người dùng không cần cài đặt thêm môi trường lập trình (Node.js, Python, Xcode framework).</w:t>
+        <w:t>QuizMaster là giải pháp phần mềm tự học và tạo đề thi trắc nghiệm chuyên nghiệp dành cho hệ điều hành macOS. Ứng dụng được biên dịch 100% bằng ngôn ngữ Swift và nền tảng SwiftUI của Apple, cho phép chạy trực tiếp và mượt mà trên tất cả các dòng máy Mac (Apple Silicon M1/M2/M3/M4 &amp; Intel) mà người dùng không cần cài đặt thêm môi trường lập trình.</w:t>
       </w:r>
     </w:p>
     <w:p>
@@ -132,7 +124,7 @@
         <w:rPr>
           <w:sz w:val="22"/>
         </w:rPr>
-        <w:t>• Tự động quét toàn bộ văn bản và sinh ra từ 15 đến 30 câu hỏi trắc nghiệm chất lượng cao phủ kín các chủ đề trong tài liệu.</w:t>
+        <w:t>• Tự động xáo trộn vị trí đáp án đúng ngẫu nhiên giữa A, B, C, D (loại bỏ hoàn toàn thiên vị đáp án A).</w:t>
       </w:r>
     </w:p>
     <w:p>
@@ -140,7 +132,7 @@
         <w:rPr>
           <w:sz w:val="22"/>
         </w:rPr>
-        <w:t>• Thuật toán Anti-bias Equalization: Đảm bảo cả 4 đáp án (A, B, C, D) có độ dài, độ phức tạp tương đương nhau, loại bỏ hoàn toàn tình trạng đáp án đúng bị dài hoặc lộ liễu.</w:t>
+        <w:t>• Chế độ điều chỉnh độ sâu câu hỏi (Depth Mode): Mặc định (Normal), Trọng tâm (Core), Chi tiết toàn bộ (Thorough - tạo đến 35-60 câu hỏi).</w:t>
       </w:r>
     </w:p>
     <w:p>
@@ -166,7 +158,7 @@
           <w:b/>
           <w:color w:val="2B579A"/>
         </w:rPr>
-        <w:t>3. Hai Chế độ Ôn tập Thông minh</w:t>
+        <w:t>3. Ba Chế độ Ôn tập Thông minh</w:t>
       </w:r>
     </w:p>
     <w:p>
@@ -174,7 +166,7 @@
         <w:rPr>
           <w:sz w:val="22"/>
         </w:rPr>
-        <w:t>• Chế độ Luyện tập (Practice Mode): Giao diện làm bài thi trắc nghiệm trực quan, hiển thị tiến độ bài thi, lưu trữ danh sách câu sai và cho phép làm lại riêng các câu làm sai qua từng vòng.</w:t>
+        <w:t>• Chế độ Luyện tập (Practice Mode): Giao diện làm bài thi trắc nghiệm trực quan với phản hồi đáp án tức thì và câu hỏi phân tích từ Gemini AI.</w:t>
       </w:r>
     </w:p>
     <w:p>
@@ -182,7 +174,7 @@
         <w:rPr>
           <w:sz w:val="22"/>
         </w:rPr>
-        <w:t>• Chế độ Thẻ Ghi Nhớ (Flashcard Mode): Thẻ 3D lật xem đáp án, đánh dấu V (Thuộc) &amp; X (Chưa thuộc). Thẻ X sẽ được tự động giữ lại để ôn tập nối tiếp ở các vòng 2, vòng 3 cho đến khi người dùng thuộc 100%.</w:t>
+        <w:t>• Chế độ Thi thử (Exam Mode): Môi trường thi thật không hiển thị đáp án đúng/sai cho tới khi bấm Nộp bài.</w:t>
       </w:r>
     </w:p>
     <w:p>
@@ -190,33 +182,7 @@
         <w:rPr>
           <w:sz w:val="22"/>
         </w:rPr>
-        <w:t/>
-      </w:r>
-    </w:p>
-    <w:p>
-      <w:r>
-        <w:rPr>
-          <w:sz w:val="28"/>
-          <w:b/>
-          <w:color w:val="2B579A"/>
-        </w:rPr>
-        <w:t>4. Định dạng Xuất / Nhập Đa dạng</w:t>
-      </w:r>
-    </w:p>
-    <w:p>
-      <w:r>
-        <w:rPr>
-          <w:sz w:val="22"/>
-        </w:rPr>
-        <w:t>• Gói Zip RTF (Mặc định): Xuất bộ đề dưới dạng file Zip chứa tệp Câu hỏi, tệp Đáp án &amp; file JSON. Đây là gói mặc định có thể nhập (re-import) ngược lại vào ứng dụng.</w:t>
-      </w:r>
-    </w:p>
-    <w:p>
-      <w:r>
-        <w:rPr>
-          <w:sz w:val="22"/>
-        </w:rPr>
-        <w:t>• Gói Zip Microsoft Word (.docx): Xuất tệp Word chuẩn (.docx) phục vụ việc in ấn hoặc xem offline.</w:t>
+        <w:t>• Chế độ Thẻ Ghi Nhớ (Flashcard Mode): Thẻ 3D lật xem đáp án, đánh dấu V (Thuộc) &amp; X (Chưa thuộc).</w:t>
       </w:r>
     </w:p>
   </w:body>

</xml_diff>